<commit_message>
fix: resolve AppContext hydration race condition and update customer verification documentation
</commit_message>
<xml_diff>
--- a/output/docx/cs-user-guideline-verifikasi-lokasi.docx
+++ b/output/docx/cs-user-guideline-verifikasi-lokasi.docx
@@ -1,6 +1,6 @@
 
 <file path=word/document.xml><?xml version="1.0" encoding="utf-8"?>
-<w:document xmlns:a="http://schemas.openxmlformats.org/drawingml/2006/main" xmlns:pic="http://schemas.openxmlformats.org/drawingml/2006/picture" xmlns:r="http://schemas.openxmlformats.org/officeDocument/2006/relationships" xmlns:w="http://schemas.openxmlformats.org/wordprocessingml/2006/main" xmlns:wp="http://schemas.openxmlformats.org/drawingml/2006/wordprocessingDrawing">
+<w:document xmlns:ns1="http://schemas.openxmlformats.org/drawingml/2006/wordprocessingDrawing" xmlns:ns2="http://schemas.openxmlformats.org/drawingml/2006/main" xmlns:ns3="http://schemas.openxmlformats.org/drawingml/2006/picture" xmlns:ns4="http://schemas.openxmlformats.org/officeDocument/2006/relationships" xmlns:w="http://schemas.openxmlformats.org/wordprocessingml/2006/main">
   <w:body>
     <w:p>
       <w:pPr>
@@ -54,7 +54,7 @@
       </w:r>
       <w:r>
         <w:rPr/>
-        <w:t> 1.0</w:t>
+        <w:t> 1.2</w:t>
       </w:r>
     </w:p>
     <w:p>
@@ -167,7 +167,259 @@
     </w:p>
     <w:p>
       <w:pPr>
+        <w:spacing w:before="0" w:after="100" w:line="276" w:lineRule="auto"/>
+        <w:pStyle w:val="Heading1"/>
+      </w:pPr>
+      <w:r>
+        <w:rPr/>
+        <w:t>Alur lengkap pemberian link kepada customer</w:t>
+      </w:r>
+    </w:p>
+    <w:p>
+      <w:pPr>
+        <w:spacing w:before="0" w:after="100" w:line="276" w:lineRule="auto"/>
+      </w:pPr>
+      <w:r>
+        <w:rPr/>
+        <w:t>Bagian ini adalah urutan kerja CS dari sebelum link dibuat sampai customer selesai. Ikuti urutan ini agar tidak mengirim link ganda atau meminta customer mengulang tanpa alasan.</w:t>
+      </w:r>
+    </w:p>
+    <w:p>
+      <w:pPr>
+        <w:spacing w:before="0" w:after="100" w:line="276" w:lineRule="auto"/>
         <w:pStyle w:val="Heading2"/>
+      </w:pPr>
+      <w:r>
+        <w:rPr/>
+        <w:t>A. Sebelum link dikirim</w:t>
+      </w:r>
+    </w:p>
+    <w:p>
+      <w:pPr>
+        <w:spacing w:before="0" w:after="100" w:line="276" w:lineRule="auto"/>
+      </w:pPr>
+      <w:r>
+        <w:rPr/>
+        <w:t>Periksa nama customer, nomor WhatsApp, alamat aktif, dan status opt-out WhatsApp. Pastikan alamat yang dipilih adalah alamat pemasangan yang benar.</w:t>
+      </w:r>
+    </w:p>
+    <w:p>
+      <w:pPr>
+        <w:spacing w:before="0" w:after="100" w:line="276" w:lineRule="auto"/>
+      </w:pPr>
+      <w:r>
+        <w:rPr/>
+        <w:t>Preview atau Preview WhatsApp hanya untuk melihat contoh pesan dan halaman. Link preview adalah link simulasi/testing, bukan link untuk customer.</w:t>
+      </w:r>
+    </w:p>
+    <w:p>
+      <w:pPr>
+        <w:spacing w:before="0" w:after="100" w:line="276" w:lineRule="auto"/>
+        <w:pStyle w:val="Heading2"/>
+      </w:pPr>
+      <w:r>
+        <w:rPr/>
+        <w:t>B. Membuat dan mengirim link</w:t>
+      </w:r>
+    </w:p>
+    <w:p>
+      <w:pPr>
+        <w:spacing w:before="0" w:after="100" w:line="276" w:lineRule="auto"/>
+      </w:pPr>
+      <w:r>
+        <w:rPr/>
+        <w:t>Untuk satu customer: buka data customer, pilih alamat aktif, pilih tindakan membuat verifikasi atau mengirim undangan, periksa data, lalu konfirmasi pengiriman. Sistem membuat sesi dan link unik, kemudian mengirim pesan WhatsApp.</w:t>
+      </w:r>
+    </w:p>
+    <w:p>
+      <w:pPr>
+        <w:spacing w:before="0" w:after="100" w:line="276" w:lineRule="auto"/>
+      </w:pPr>
+      <w:r>
+        <w:rPr/>
+        <w:t>Untuk banyak customer: buka Blasting Verifikasi WhatsApp, pilih customer yang eligible, periksa jumlah target, isi pengaturan blasting, gunakan Preview untuk mengecek pesan, lalu pilih Buat &amp; mulai blasting. Pengiriman dilakukan bertahap oleh queue.</w:t>
+      </w:r>
+    </w:p>
+    <w:p>
+      <w:pPr>
+        <w:spacing w:before="0" w:after="100" w:line="276" w:lineRule="auto"/>
+        <w:pStyle w:val="Heading2"/>
+      </w:pPr>
+      <w:r>
+        <w:rPr/>
+        <w:t>C. Mengecek status WhatsApp</w:t>
+      </w:r>
+    </w:p>
+    <w:p>
+      <w:pPr>
+        <w:spacing w:before="0" w:after="100" w:line="276" w:lineRule="auto"/>
+      </w:pPr>
+      <w:r>
+        <w:rPr/>
+        <w:t>Menunggu atau Sedang diproses berarti pesan belum selesai dikirim. Diterima provider berarti provider menerima permintaan, tetapi belum pasti masuk ke HP customer. Terkirim berarti pesan sudah diterima. Dibaca berarti pesan sudah dibuka. Gagal, Provider tidak tersedia, dan Opt-out perlu diperiksa sebelum mengirim ulang.</w:t>
+      </w:r>
+    </w:p>
+    <w:p>
+      <w:pPr>
+        <w:spacing w:before="0" w:after="100" w:line="276" w:lineRule="auto"/>
+      </w:pPr>
+      <w:r>
+        <w:rPr/>
+        <w:t>Jika customer belum menerima pesan, jangan langsung membuat link baru. Periksa nomor, status delivery, dan status sesi terlebih dahulu.</w:t>
+      </w:r>
+    </w:p>
+    <w:p>
+      <w:pPr>
+        <w:spacing w:before="0" w:after="100" w:line="276" w:lineRule="auto"/>
+        <w:pStyle w:val="Heading2"/>
+      </w:pPr>
+      <w:r>
+        <w:rPr/>
+        <w:t>D. Customer membuka link</w:t>
+      </w:r>
+    </w:p>
+    <w:p>
+      <w:pPr>
+        <w:spacing w:before="0" w:after="100" w:line="276" w:lineRule="auto"/>
+      </w:pPr>
+      <w:r>
+        <w:rPr/>
+        <w:t>Customer harus memakai link terbaru dan membukanya saat berada di alamat pemasangan. Customer memeriksa nama dan alamat, memilih Ya, data saya benar, mengizinkan lokasi, lalu diam sampai pemeriksaan GPS selesai.</w:t>
+      </w:r>
+    </w:p>
+    <w:p>
+      <w:pPr>
+        <w:spacing w:before="0" w:after="100" w:line="276" w:lineRule="auto"/>
+      </w:pPr>
+      <w:r>
+        <w:rPr/>
+        <w:t>Jika data bukan milik customer, customer memilih Data saya berbeda dan menghubungi CS. Proses tidak boleh dilanjutkan.</w:t>
+      </w:r>
+    </w:p>
+    <w:p>
+      <w:pPr>
+        <w:spacing w:before="0" w:after="100" w:line="276" w:lineRule="auto"/>
+        <w:pStyle w:val="Heading2"/>
+      </w:pPr>
+      <w:r>
+        <w:rPr/>
+        <w:t>E. Jika customer belum berada di alamat</w:t>
+      </w:r>
+    </w:p>
+    <w:p>
+      <w:pPr>
+        <w:spacing w:before="0" w:after="100" w:line="276" w:lineRule="auto"/>
+      </w:pPr>
+      <w:r>
+        <w:rPr/>
+        <w:t>Customer memilih Ingatkan saya nanti dan memilih waktu yang akan datang. Setelah itu halaman menampilkan Pengingat sudah dipilih. Customer tidak perlu memilih reminder lagi; tunggu link reminder baru melalui WhatsApp.</w:t>
+      </w:r>
+    </w:p>
+    <w:p>
+      <w:pPr>
+        <w:spacing w:before="0" w:after="100" w:line="276" w:lineRule="auto"/>
+      </w:pPr>
+      <w:r>
+        <w:rPr/>
+        <w:t>Jika link awal tidak dibuka dan fitur reminder aktif, sistem dapat mengirim reminder otomatis sesuai konfigurasi. CS tidak perlu mengirim link manual berulang-ulang tanpa memeriksa status sesi.</w:t>
+      </w:r>
+    </w:p>
+    <w:p>
+      <w:pPr>
+        <w:spacing w:before="0" w:after="100" w:line="276" w:lineRule="auto"/>
+        <w:pStyle w:val="Heading2"/>
+      </w:pPr>
+      <w:r>
+        <w:rPr/>
+        <w:t>F. Jika link dikirim ulang</w:t>
+      </w:r>
+    </w:p>
+    <w:p>
+      <w:pPr>
+        <w:spacing w:before="0" w:after="100" w:line="276" w:lineRule="auto"/>
+      </w:pPr>
+      <w:r>
+        <w:rPr/>
+        <w:t>Kirim ulang undangan membuat link baru dan membuat link lama tidak berlaku. Customer harus memakai link yang paling baru. Jangan gunakan kirim ulang biasa untuk customer yang sudah selesai dan valid.</w:t>
+      </w:r>
+    </w:p>
+    <w:p>
+      <w:pPr>
+        <w:spacing w:before="0" w:after="100" w:line="276" w:lineRule="auto"/>
+        <w:pStyle w:val="Heading2"/>
+      </w:pPr>
+      <w:r>
+        <w:rPr/>
+        <w:t>G. Jika batas GPS dan reminder habis</w:t>
+      </w:r>
+    </w:p>
+    <w:p>
+      <w:pPr>
+        <w:spacing w:before="0" w:after="100" w:line="276" w:lineRule="auto"/>
+      </w:pPr>
+      <w:r>
+        <w:rPr/>
+        <w:t>Satu sesi memiliki maksimal 3 percobaan GPS dan maksimal 3 reminder sesuai konfigurasi aplikasi. Jangan meminta customer menekan tombol berulang. Periksa dashboard dan eskalasikan ke Ops.</w:t>
+      </w:r>
+    </w:p>
+    <w:p>
+      <w:pPr>
+        <w:spacing w:before="0" w:after="100" w:line="276" w:lineRule="auto"/>
+      </w:pPr>
+      <w:r>
+        <w:rPr/>
+        <w:t>Jika syaratnya terpenuhi, admin yang memiliki hak kirim dapat memilih Kirim Ulang Link untuk membuat siklus baru. Sesi lama tetap menjadi riwayat dan link lama tidak dipakai.</w:t>
+      </w:r>
+    </w:p>
+    <w:p>
+      <w:pPr>
+        <w:spacing w:before="0" w:after="100" w:line="276" w:lineRule="auto"/>
+        <w:pStyle w:val="Heading2"/>
+      </w:pPr>
+      <w:r>
+        <w:rPr/>
+        <w:t>Kalimat paling mudah untuk customer</w:t>
+      </w:r>
+    </w:p>
+    <w:p>
+      <w:pPr>
+        <w:spacing w:before="0" w:after="100" w:line="276" w:lineRule="auto"/>
+      </w:pPr>
+      <w:r>
+        <w:rPr/>
+        <w:t>Tujuan link: “Link ini untuk memastikan alamat pemasangan dan lokasi HP Anda sesuai. Tidak perlu instal aplikasi.”</w:t>
+      </w:r>
+    </w:p>
+    <w:p>
+      <w:pPr>
+        <w:spacing w:before="0" w:after="100" w:line="276" w:lineRule="auto"/>
+      </w:pPr>
+      <w:r>
+        <w:rPr/>
+        <w:t>Belum di rumah: “Pilih Ingatkan saya nanti. Buka link pengingat saat sudah berada di alamat pemasangan.”</w:t>
+      </w:r>
+    </w:p>
+    <w:p>
+      <w:pPr>
+        <w:spacing w:before="0" w:after="100" w:line="276" w:lineRule="auto"/>
+      </w:pPr>
+      <w:r>
+        <w:rPr/>
+        <w:t>Lokasi belum cocok: “Pastikan Anda berada di alamat pemasangan, nyalakan Lokasi Presisi, lalu coba lagi di area terbuka tanpa berpindah tempat.”</w:t>
+      </w:r>
+    </w:p>
+    <w:p>
+      <w:pPr>
+        <w:spacing w:before="0" w:after="100" w:line="276" w:lineRule="auto"/>
+      </w:pPr>
+      <w:r>
+        <w:rPr/>
+        <w:t>Batas tercapai: “Percobaan pada sesi ini sudah mencapai batas. Mohon jangan mencoba berulang kali. Kami akan membantu melalui tim IRA.”</w:t>
+      </w:r>
+    </w:p>
+    <w:p>
+      <w:pPr>
+        <w:pStyle w:val="Heading2"/>
         <w:spacing w:before="0" w:after="110" w:line="276" w:lineRule="auto"/>
         <w:keepNext/>
       </w:pPr>
@@ -276,35 +528,35 @@
       </w:pPr>
       <w:r>
         <w:drawing>
-          <wp:inline distT="0" distB="0" distL="0" distR="0">
-            <wp:extent cx="5349240" cy="8358187"/>
-            <wp:docPr id="1" name="screenshot-01-data-desktop" descr="Screenshot UI verifikasi lokasi dengan data dummy"/>
-            <a:graphic>
-              <a:graphicData uri="http://schemas.openxmlformats.org/drawingml/2006/picture">
-                <pic:pic>
-                  <pic:nvPicPr>
-                    <pic:cNvPr id="0" name="screenshot-01-data-desktop.png"/>
-                    <pic:cNvPicPr/>
-                  </pic:nvPicPr>
-                  <pic:blipFill>
-                    <a:blip r:embed="rId1"/>
-                    <a:stretch>
-                      <a:fillRect/>
-                    </a:stretch>
-                  </pic:blipFill>
-                  <pic:spPr>
-                    <a:xfrm>
-                      <a:off x="0" y="0"/>
-                      <a:ext cx="5349240" cy="8358187"/>
-                    </a:xfrm>
-                    <a:prstGeom prst="rect">
-                      <a:avLst/>
-                    </a:prstGeom>
-                  </pic:spPr>
-                </pic:pic>
-              </a:graphicData>
-            </a:graphic>
-          </wp:inline>
+          <ns1:inline distT="0" distB="0" distL="0" distR="0">
+            <ns1:extent cx="5349240" cy="8358187"/>
+            <ns1:docPr id="1" name="screenshot-01-data-desktop" descr="Screenshot UI verifikasi lokasi dengan data dummy"/>
+            <ns2:graphic>
+              <ns2:graphicData uri="http://schemas.openxmlformats.org/drawingml/2006/picture">
+                <ns3:pic>
+                  <ns3:nvPicPr>
+                    <ns3:cNvPr id="0" name="screenshot-01-data-desktop.png"/>
+                    <ns3:cNvPicPr/>
+                  </ns3:nvPicPr>
+                  <ns3:blipFill>
+                    <ns2:blip ns4:embed="rId1"/>
+                    <ns2:stretch>
+                      <ns2:fillRect/>
+                    </ns2:stretch>
+                  </ns3:blipFill>
+                  <ns3:spPr>
+                    <ns2:xfrm>
+                      <ns2:off x="0" y="0"/>
+                      <ns2:ext cx="5349240" cy="8358187"/>
+                    </ns2:xfrm>
+                    <ns2:prstGeom prst="rect">
+                      <ns2:avLst/>
+                    </ns2:prstGeom>
+                  </ns3:spPr>
+                </ns3:pic>
+              </ns2:graphicData>
+            </ns2:graphic>
+          </ns1:inline>
         </w:drawing>
       </w:r>
     </w:p>
@@ -323,35 +575,35 @@
       </w:pPr>
       <w:r>
         <w:drawing>
-          <wp:inline distT="0" distB="0" distL="0" distR="0">
-            <wp:extent cx="5074920" cy="4893672"/>
-            <wp:docPr id="2" name="screenshot-01-address-card" descr="Screenshot UI verifikasi lokasi dengan data dummy"/>
-            <a:graphic>
-              <a:graphicData uri="http://schemas.openxmlformats.org/drawingml/2006/picture">
-                <pic:pic>
-                  <pic:nvPicPr>
-                    <pic:cNvPr id="0" name="screenshot-01-address-card.png"/>
-                    <pic:cNvPicPr/>
-                  </pic:nvPicPr>
-                  <pic:blipFill>
-                    <a:blip r:embed="rId2"/>
-                    <a:stretch>
-                      <a:fillRect/>
-                    </a:stretch>
-                  </pic:blipFill>
-                  <pic:spPr>
-                    <a:xfrm>
-                      <a:off x="0" y="0"/>
-                      <a:ext cx="5074920" cy="4893672"/>
-                    </a:xfrm>
-                    <a:prstGeom prst="rect">
-                      <a:avLst/>
-                    </a:prstGeom>
-                  </pic:spPr>
-                </pic:pic>
-              </a:graphicData>
-            </a:graphic>
-          </wp:inline>
+          <ns1:inline distT="0" distB="0" distL="0" distR="0">
+            <ns1:extent cx="5074920" cy="4893672"/>
+            <ns1:docPr id="2" name="screenshot-01-address-card" descr="Screenshot UI verifikasi lokasi dengan data dummy"/>
+            <ns2:graphic>
+              <ns2:graphicData uri="http://schemas.openxmlformats.org/drawingml/2006/picture">
+                <ns3:pic>
+                  <ns3:nvPicPr>
+                    <ns3:cNvPr id="0" name="screenshot-01-address-card.png"/>
+                    <ns3:cNvPicPr/>
+                  </ns3:nvPicPr>
+                  <ns3:blipFill>
+                    <ns2:blip ns4:embed="rId2"/>
+                    <ns2:stretch>
+                      <ns2:fillRect/>
+                    </ns2:stretch>
+                  </ns3:blipFill>
+                  <ns3:spPr>
+                    <ns2:xfrm>
+                      <ns2:off x="0" y="0"/>
+                      <ns2:ext cx="5074920" cy="4893672"/>
+                    </ns2:xfrm>
+                    <ns2:prstGeom prst="rect">
+                      <ns2:avLst/>
+                    </ns2:prstGeom>
+                  </ns3:spPr>
+                </ns3:pic>
+              </ns2:graphicData>
+            </ns2:graphic>
+          </ns1:inline>
         </w:drawing>
       </w:r>
     </w:p>
@@ -370,35 +622,35 @@
       </w:pPr>
       <w:r>
         <w:drawing>
-          <wp:inline distT="0" distB="0" distL="0" distR="0">
-            <wp:extent cx="5074920" cy="1903095"/>
-            <wp:docPr id="3" name="screenshot-01-actions" descr="Screenshot UI verifikasi lokasi dengan data dummy"/>
-            <a:graphic>
-              <a:graphicData uri="http://schemas.openxmlformats.org/drawingml/2006/picture">
-                <pic:pic>
-                  <pic:nvPicPr>
-                    <pic:cNvPr id="0" name="screenshot-01-actions.png"/>
-                    <pic:cNvPicPr/>
-                  </pic:nvPicPr>
-                  <pic:blipFill>
-                    <a:blip r:embed="rId3"/>
-                    <a:stretch>
-                      <a:fillRect/>
-                    </a:stretch>
-                  </pic:blipFill>
-                  <pic:spPr>
-                    <a:xfrm>
-                      <a:off x="0" y="0"/>
-                      <a:ext cx="5074920" cy="1903095"/>
-                    </a:xfrm>
-                    <a:prstGeom prst="rect">
-                      <a:avLst/>
-                    </a:prstGeom>
-                  </pic:spPr>
-                </pic:pic>
-              </a:graphicData>
-            </a:graphic>
-          </wp:inline>
+          <ns1:inline distT="0" distB="0" distL="0" distR="0">
+            <ns1:extent cx="5074920" cy="1903095"/>
+            <ns1:docPr id="3" name="screenshot-01-actions" descr="Screenshot UI verifikasi lokasi dengan data dummy"/>
+            <ns2:graphic>
+              <ns2:graphicData uri="http://schemas.openxmlformats.org/drawingml/2006/picture">
+                <ns3:pic>
+                  <ns3:nvPicPr>
+                    <ns3:cNvPr id="0" name="screenshot-01-actions.png"/>
+                    <ns3:cNvPicPr/>
+                  </ns3:nvPicPr>
+                  <ns3:blipFill>
+                    <ns2:blip ns4:embed="rId3"/>
+                    <ns2:stretch>
+                      <ns2:fillRect/>
+                    </ns2:stretch>
+                  </ns3:blipFill>
+                  <ns3:spPr>
+                    <ns2:xfrm>
+                      <ns2:off x="0" y="0"/>
+                      <ns2:ext cx="5074920" cy="1903095"/>
+                    </ns2:xfrm>
+                    <ns2:prstGeom prst="rect">
+                      <ns2:avLst/>
+                    </ns2:prstGeom>
+                  </ns3:spPr>
+                </ns3:pic>
+              </ns2:graphicData>
+            </ns2:graphic>
+          </ns1:inline>
         </w:drawing>
       </w:r>
     </w:p>
@@ -869,35 +1121,35 @@
       </w:pPr>
       <w:r>
         <w:drawing>
-          <wp:inline distT="0" distB="0" distL="0" distR="0">
-            <wp:extent cx="5166360" cy="8072437"/>
-            <wp:docPr id="104" name="screenshot-02-confirmed.png" descr="Screenshot UI verifikasi lokasi dengan data dummy"/>
-            <a:graphic>
-              <a:graphicData uri="http://schemas.openxmlformats.org/drawingml/2006/picture">
-                <pic:pic>
-                  <pic:nvPicPr>
-                    <pic:cNvPr id="0" name="screenshot-02-confirmed.png"/>
-                    <pic:cNvPicPr/>
-                  </pic:nvPicPr>
-                  <pic:blipFill>
-                    <a:blip r:embed="rId4"/>
-                    <a:stretch>
-                      <a:fillRect/>
-                    </a:stretch>
-                  </pic:blipFill>
-                  <pic:spPr>
-                    <a:xfrm>
-                      <a:off x="0" y="0"/>
-                      <a:ext cx="5166360" cy="8072437"/>
-                    </a:xfrm>
-                    <a:prstGeom prst="rect">
-                      <a:avLst/>
-                    </a:prstGeom>
-                  </pic:spPr>
-                </pic:pic>
-              </a:graphicData>
-            </a:graphic>
-          </wp:inline>
+          <ns1:inline distT="0" distB="0" distL="0" distR="0">
+            <ns1:extent cx="5166360" cy="8072437"/>
+            <ns1:docPr id="104" name="screenshot-02-confirmed.png" descr="Screenshot UI verifikasi lokasi dengan data dummy"/>
+            <ns2:graphic>
+              <ns2:graphicData uri="http://schemas.openxmlformats.org/drawingml/2006/picture">
+                <ns3:pic>
+                  <ns3:nvPicPr>
+                    <ns3:cNvPr id="0" name="screenshot-02-confirmed.png"/>
+                    <ns3:cNvPicPr/>
+                  </ns3:nvPicPr>
+                  <ns3:blipFill>
+                    <ns2:blip ns4:embed="rId4"/>
+                    <ns2:stretch>
+                      <ns2:fillRect/>
+                    </ns2:stretch>
+                  </ns3:blipFill>
+                  <ns3:spPr>
+                    <ns2:xfrm>
+                      <ns2:off x="0" y="0"/>
+                      <ns2:ext cx="5166360" cy="8072437"/>
+                    </ns2:xfrm>
+                    <ns2:prstGeom prst="rect">
+                      <ns2:avLst/>
+                    </ns2:prstGeom>
+                  </ns3:spPr>
+                </ns3:pic>
+              </ns2:graphicData>
+            </ns2:graphic>
+          </ns1:inline>
         </w:drawing>
       </w:r>
     </w:p>
@@ -925,35 +1177,35 @@
       </w:pPr>
       <w:r>
         <w:drawing>
-          <wp:inline distT="0" distB="0" distL="0" distR="0">
-            <wp:extent cx="5166360" cy="8072437"/>
-            <wp:docPr id="105" name="screenshot-invalid-link.png" descr="Screenshot UI verifikasi lokasi dengan data dummy"/>
-            <a:graphic>
-              <a:graphicData uri="http://schemas.openxmlformats.org/drawingml/2006/picture">
-                <pic:pic>
-                  <pic:nvPicPr>
-                    <pic:cNvPr id="0" name="screenshot-invalid-link.png"/>
-                    <pic:cNvPicPr/>
-                  </pic:nvPicPr>
-                  <pic:blipFill>
-                    <a:blip r:embed="rId5"/>
-                    <a:stretch>
-                      <a:fillRect/>
-                    </a:stretch>
-                  </pic:blipFill>
-                  <pic:spPr>
-                    <a:xfrm>
-                      <a:off x="0" y="0"/>
-                      <a:ext cx="5166360" cy="8072437"/>
-                    </a:xfrm>
-                    <a:prstGeom prst="rect">
-                      <a:avLst/>
-                    </a:prstGeom>
-                  </pic:spPr>
-                </pic:pic>
-              </a:graphicData>
-            </a:graphic>
-          </wp:inline>
+          <ns1:inline distT="0" distB="0" distL="0" distR="0">
+            <ns1:extent cx="5166360" cy="8072437"/>
+            <ns1:docPr id="105" name="screenshot-invalid-link.png" descr="Screenshot UI verifikasi lokasi dengan data dummy"/>
+            <ns2:graphic>
+              <ns2:graphicData uri="http://schemas.openxmlformats.org/drawingml/2006/picture">
+                <ns3:pic>
+                  <ns3:nvPicPr>
+                    <ns3:cNvPr id="0" name="screenshot-invalid-link.png"/>
+                    <ns3:cNvPicPr/>
+                  </ns3:nvPicPr>
+                  <ns3:blipFill>
+                    <ns2:blip ns4:embed="rId5"/>
+                    <ns2:stretch>
+                      <ns2:fillRect/>
+                    </ns2:stretch>
+                  </ns3:blipFill>
+                  <ns3:spPr>
+                    <ns2:xfrm>
+                      <ns2:off x="0" y="0"/>
+                      <ns2:ext cx="5166360" cy="8072437"/>
+                    </ns2:xfrm>
+                    <ns2:prstGeom prst="rect">
+                      <ns2:avLst/>
+                    </ns2:prstGeom>
+                  </ns3:spPr>
+                </ns3:pic>
+              </ns2:graphicData>
+            </ns2:graphic>
+          </ns1:inline>
         </w:drawing>
       </w:r>
     </w:p>
@@ -964,6 +1216,385 @@
       <w:r>
         <w:rPr/>
         <w:t>Arahan CS: jangan meminta customer mengubah URL. Periksa status sesi, masa berlaku, nomor WhatsApp, dan status pengiriman. Jika sesi memang tidak valid atau kedaluwarsa, kirim tautan baru melalui proses resmi.</w:t>
+      </w:r>
+    </w:p>
+    <w:p>
+      <w:pPr>
+        <w:spacing w:before="0" w:after="100" w:line="276" w:lineRule="auto"/>
+        <w:pStyle w:val="Heading2"/>
+      </w:pPr>
+      <w:r>
+        <w:rPr/>
+        <w:t>Screenshot case operasional yang sering ditanyakan</w:t>
+      </w:r>
+    </w:p>
+    <w:p>
+      <w:pPr>
+        <w:spacing w:before="0" w:after="100" w:line="276" w:lineRule="auto"/>
+      </w:pPr>
+      <w:r>
+        <w:rPr/>
+        <w:t>Bagian ini menunjukkan bentuk halaman yang dilihat customer pada state yang paling sering ditanyakan CS. Semua gambar berasal dari UI aplikasi yang dirender dengan mode simulasi dan data dummy; gunakan sebagai referensi posisi tombol dan arti status, bukan sebagai data customer nyata.</w:t>
+      </w:r>
+    </w:p>
+    <w:p>
+      <w:pPr>
+        <w:spacing w:before="0" w:after="80" w:line="276" w:lineRule="auto"/>
+        <w:jc w:val="center"/>
+      </w:pPr>
+      <w:r>
+        <w:drawing>
+          <ns1:inline distT="0" distB="0" distL="0" distR="0">
+            <ns1:extent cx="3977640" cy="7473600"/>
+            <ns1:docPr id="200" name="screenshot-03-gps-checking" descr="Screenshot UI aplikasi dengan data simulasi dummy"/>
+            <ns2:graphic>
+              <ns2:graphicData uri="http://schemas.openxmlformats.org/drawingml/2006/picture">
+                <ns3:pic>
+                  <ns3:nvPicPr>
+                    <ns3:cNvPr id="0" name="screenshot-03-gps-checking.png"/>
+                    <ns3:cNvPicPr/>
+                  </ns3:nvPicPr>
+                  <ns3:blipFill>
+                    <ns2:blip ns4:embed="rId6"/>
+                    <ns2:stretch>
+                      <ns2:fillRect/>
+                    </ns2:stretch>
+                  </ns3:blipFill>
+                  <ns3:spPr>
+                    <ns2:xfrm>
+                      <ns2:off x="0" y="0"/>
+                      <ns2:ext cx="3977640" cy="7473600"/>
+                    </ns2:xfrm>
+                    <ns2:prstGeom prst="rect">
+                      <ns2:avLst/>
+                    </ns2:prstGeom>
+                  </ns3:spPr>
+                </ns3:pic>
+              </ns2:graphicData>
+            </ns2:graphic>
+          </ns1:inline>
+        </w:drawing>
+      </w:r>
+    </w:p>
+    <w:p>
+      <w:pPr>
+        <w:spacing w:before="0" w:after="100" w:line="276" w:lineRule="auto"/>
+        <w:jc w:val="center"/>
+      </w:pPr>
+      <w:r>
+        <w:rPr>
+          <w:b/>
+        </w:rPr>
+        <w:t>Gambar 6 — State checking GPS: “Sedang memeriksa lokasi Anda”.</w:t>
+      </w:r>
+    </w:p>
+    <w:p>
+      <w:pPr>
+        <w:spacing w:before="0" w:after="100" w:line="276" w:lineRule="auto"/>
+      </w:pPr>
+      <w:r>
+        <w:rPr/>
+        <w:t>Arahan CS: customer tetap berada di alamat pemasangan, diam di tempat, dan menunggu sampai sekitar 30 detik. Jangan menutup atau memuat ulang browser. Jika proses berhenti atau gagal, arahkan customer mengikuti state error dan gunakan tombol coba lagi satu kali setelah kondisi GPS diperbaiki.</w:t>
+      </w:r>
+    </w:p>
+    <w:p>
+      <w:pPr>
+        <w:spacing w:before="0" w:after="80" w:line="276" w:lineRule="auto"/>
+        <w:jc w:val="center"/>
+      </w:pPr>
+      <w:r>
+        <w:drawing>
+          <ns1:inline distT="0" distB="0" distL="0" distR="0">
+            <ns1:extent cx="3977640" cy="7473600"/>
+            <ns1:docPr id="201" name="screenshot-04-location-mismatch" descr="Screenshot UI aplikasi dengan data simulasi dummy"/>
+            <ns2:graphic>
+              <ns2:graphicData uri="http://schemas.openxmlformats.org/drawingml/2006/picture">
+                <ns3:pic>
+                  <ns3:nvPicPr>
+                    <ns3:cNvPr id="0" name="screenshot-04-location-mismatch.png"/>
+                    <ns3:cNvPicPr/>
+                  </ns3:nvPicPr>
+                  <ns3:blipFill>
+                    <ns2:blip ns4:embed="rId7"/>
+                    <ns2:stretch>
+                      <ns2:fillRect/>
+                    </ns2:stretch>
+                  </ns3:blipFill>
+                  <ns3:spPr>
+                    <ns2:xfrm>
+                      <ns2:off x="0" y="0"/>
+                      <ns2:ext cx="3977640" cy="7473600"/>
+                    </ns2:xfrm>
+                    <ns2:prstGeom prst="rect">
+                      <ns2:avLst/>
+                    </ns2:prstGeom>
+                  </ns3:spPr>
+                </ns3:pic>
+              </ns2:graphicData>
+            </ns2:graphic>
+          </ns1:inline>
+        </w:drawing>
+      </w:r>
+    </w:p>
+    <w:p>
+      <w:pPr>
+        <w:spacing w:before="0" w:after="100" w:line="276" w:lineRule="auto"/>
+        <w:jc w:val="center"/>
+      </w:pPr>
+      <w:r>
+        <w:rPr>
+          <w:b/>
+        </w:rPr>
+        <w:t>Gambar 7 — State gagal karena lokasi HP belum sesuai dengan alamat pemasangan.</w:t>
+      </w:r>
+    </w:p>
+    <w:p>
+      <w:pPr>
+        <w:spacing w:before="0" w:after="100" w:line="276" w:lineRule="auto"/>
+      </w:pPr>
+      <w:r>
+        <w:rPr/>
+        <w:t>Cara membaca state ini: tabel membandingkan data terdaftar dengan hasil GPS. “Tidak cocok” pada kelurahan, jalan, atau nomor rumah menunjukkan bagian yang perlu diperiksa; ini bukan alasan untuk mengubah alamat yang sebenarnya benar. Arahan CS: pastikan customer berada di alamat pemasangan, aktifkan lokasi presisi, tekan “Coba verifikasi lokasi lagi”, lalu pilih “Alamat saya sudah berubah” hanya jika alamat memang berubah atau “Ingatkan saya nanti” jika customer belum berada di lokasi.</w:t>
+      </w:r>
+    </w:p>
+    <w:p>
+      <w:pPr>
+        <w:spacing w:before="0" w:after="80" w:line="276" w:lineRule="auto"/>
+        <w:jc w:val="center"/>
+      </w:pPr>
+      <w:r>
+        <w:drawing>
+          <ns1:inline distT="0" distB="0" distL="0" distR="0">
+            <ns1:extent cx="3977640" cy="7473600"/>
+            <ns1:docPr id="202" name="screenshot-05-address-form" descr="Screenshot UI aplikasi dengan data simulasi dummy"/>
+            <ns2:graphic>
+              <ns2:graphicData uri="http://schemas.openxmlformats.org/drawingml/2006/picture">
+                <ns3:pic>
+                  <ns3:nvPicPr>
+                    <ns3:cNvPr id="0" name="screenshot-05-address-form.png"/>
+                    <ns3:cNvPicPr/>
+                  </ns3:nvPicPr>
+                  <ns3:blipFill>
+                    <ns2:blip ns4:embed="rId8"/>
+                    <ns2:stretch>
+                      <ns2:fillRect/>
+                    </ns2:stretch>
+                  </ns3:blipFill>
+                  <ns3:spPr>
+                    <ns2:xfrm>
+                      <ns2:off x="0" y="0"/>
+                      <ns2:ext cx="3977640" cy="7473600"/>
+                    </ns2:xfrm>
+                    <ns2:prstGeom prst="rect">
+                      <ns2:avLst/>
+                    </ns2:prstGeom>
+                  </ns3:spPr>
+                </ns3:pic>
+              </ns2:graphicData>
+            </ns2:graphic>
+          </ns1:inline>
+        </w:drawing>
+      </w:r>
+    </w:p>
+    <w:p>
+      <w:pPr>
+        <w:spacing w:before="0" w:after="100" w:line="276" w:lineRule="auto"/>
+        <w:jc w:val="center"/>
+      </w:pPr>
+      <w:r>
+        <w:rPr>
+          <w:b/>
+        </w:rPr>
+        <w:t>Gambar 8 — Form “Ajukan alamat baru” ketika alamat customer memang berubah.</w:t>
+      </w:r>
+    </w:p>
+    <w:p>
+      <w:pPr>
+        <w:spacing w:before="0" w:after="100" w:line="276" w:lineRule="auto"/>
+      </w:pPr>
+      <w:r>
+        <w:rPr/>
+        <w:t>Arahan CS: customer wajib mengisi provinsi, kota/kabupaten, kecamatan, kelurahan/desa, dan nama jalan/perumahan. Nomor rumah, kode pos, dan detail alamat boleh dikosongkan jika memang tidak tersedia. Minta nama jalan ditulis mengikuti Google Maps dan tambahkan patokan jika perlu. Setelah menekan “Ajukan alamat untuk verifikasi ulang”, customer masih wajib melakukan pemeriksaan GPS di alamat baru.</w:t>
+      </w:r>
+    </w:p>
+    <w:p>
+      <w:pPr>
+        <w:spacing w:before="0" w:after="80" w:line="276" w:lineRule="auto"/>
+        <w:jc w:val="center"/>
+      </w:pPr>
+      <w:r>
+        <w:drawing>
+          <ns1:inline distT="0" distB="0" distL="0" distR="0">
+            <ns1:extent cx="3977640" cy="7473600"/>
+            <ns1:docPr id="203" name="screenshot-06-reminder-selected" descr="Screenshot UI aplikasi dengan data simulasi dummy"/>
+            <ns2:graphic>
+              <ns2:graphicData uri="http://schemas.openxmlformats.org/drawingml/2006/picture">
+                <ns3:pic>
+                  <ns3:nvPicPr>
+                    <ns3:cNvPr id="0" name="screenshot-06-reminder-selected.png"/>
+                    <ns3:cNvPicPr/>
+                  </ns3:nvPicPr>
+                  <ns3:blipFill>
+                    <ns2:blip ns4:embed="rId9"/>
+                    <ns2:stretch>
+                      <ns2:fillRect/>
+                    </ns2:stretch>
+                  </ns3:blipFill>
+                  <ns3:spPr>
+                    <ns2:xfrm>
+                      <ns2:off x="0" y="0"/>
+                      <ns2:ext cx="3977640" cy="7473600"/>
+                    </ns2:xfrm>
+                    <ns2:prstGeom prst="rect">
+                      <ns2:avLst/>
+                    </ns2:prstGeom>
+                  </ns3:spPr>
+                </ns3:pic>
+              </ns2:graphicData>
+            </ns2:graphic>
+          </ns1:inline>
+        </w:drawing>
+      </w:r>
+    </w:p>
+    <w:p>
+      <w:pPr>
+        <w:spacing w:before="0" w:after="100" w:line="276" w:lineRule="auto"/>
+        <w:jc w:val="center"/>
+      </w:pPr>
+      <w:r>
+        <w:rPr>
+          <w:b/>
+        </w:rPr>
+        <w:t>Gambar 9 — State “Pengingat sudah dipilih” setelah customer memilih jadwal reminder.</w:t>
+      </w:r>
+    </w:p>
+    <w:p>
+      <w:pPr>
+        <w:spacing w:before="0" w:after="100" w:line="276" w:lineRule="auto"/>
+      </w:pPr>
+      <w:r>
+        <w:rPr/>
+        <w:t>Arahan CS: customer tidak perlu memilih reminder lagi dan tidak perlu mengulang pemeriksaan dari lokasi lain. Tunggu link reminder baru yang dikirim melalui WhatsApp, kemudian buka link tersebut saat sudah berada di alamat pemasangan. Angka “Sisa reminder” menunjukkan kuota reminder yang masih tersedia.</w:t>
+      </w:r>
+    </w:p>
+    <w:p>
+      <w:pPr>
+        <w:spacing w:before="0" w:after="80" w:line="276" w:lineRule="auto"/>
+        <w:jc w:val="center"/>
+      </w:pPr>
+      <w:r>
+        <w:drawing>
+          <ns1:inline distT="0" distB="0" distL="0" distR="0">
+            <ns1:extent cx="3977640" cy="7473600"/>
+            <ns1:docPr id="204" name="screenshot-07-reminder-link-ready" descr="Screenshot UI aplikasi dengan data simulasi dummy"/>
+            <ns2:graphic>
+              <ns2:graphicData uri="http://schemas.openxmlformats.org/drawingml/2006/picture">
+                <ns3:pic>
+                  <ns3:nvPicPr>
+                    <ns3:cNvPr id="0" name="screenshot-07-reminder-link-ready.png"/>
+                    <ns3:cNvPicPr/>
+                  </ns3:nvPicPr>
+                  <ns3:blipFill>
+                    <ns2:blip ns4:embed="rId10"/>
+                    <ns2:stretch>
+                      <ns2:fillRect/>
+                    </ns2:stretch>
+                  </ns3:blipFill>
+                  <ns3:spPr>
+                    <ns2:xfrm>
+                      <ns2:off x="0" y="0"/>
+                      <ns2:ext cx="3977640" cy="7473600"/>
+                    </ns2:xfrm>
+                    <ns2:prstGeom prst="rect">
+                      <ns2:avLst/>
+                    </ns2:prstGeom>
+                  </ns3:spPr>
+                </ns3:pic>
+              </ns2:graphicData>
+            </ns2:graphic>
+          </ns1:inline>
+        </w:drawing>
+      </w:r>
+    </w:p>
+    <w:p>
+      <w:pPr>
+        <w:spacing w:before="0" w:after="100" w:line="276" w:lineRule="auto"/>
+        <w:jc w:val="center"/>
+      </w:pPr>
+      <w:r>
+        <w:rPr>
+          <w:b/>
+        </w:rPr>
+        <w:t>Gambar 10 — State link reminder baru sudah diterima.</w:t>
+      </w:r>
+    </w:p>
+    <w:p>
+      <w:pPr>
+        <w:spacing w:before="0" w:after="100" w:line="276" w:lineRule="auto"/>
+      </w:pPr>
+      <w:r>
+        <w:rPr/>
+        <w:t>Arahan CS: jika customer sudah berada di alamat pemasangan, tekan “Saya sudah di alamat, mulai verifikasi”, izinkan akses lokasi, lalu diam sampai proses selesai. Tombol “Alamat saya sudah berubah” hanya digunakan bila alamat benar-benar berubah. Tombol reminder tambahan hanya boleh digunakan jika kuota masih tersedia.</w:t>
+      </w:r>
+    </w:p>
+    <w:p>
+      <w:pPr>
+        <w:spacing w:before="0" w:after="80" w:line="276" w:lineRule="auto"/>
+        <w:jc w:val="center"/>
+      </w:pPr>
+      <w:r>
+        <w:drawing>
+          <ns1:inline distT="0" distB="0" distL="0" distR="0">
+            <ns1:extent cx="3977640" cy="7473600"/>
+            <ns1:docPr id="205" name="screenshot-08-reminder-limit" descr="Screenshot UI aplikasi dengan data simulasi dummy"/>
+            <ns2:graphic>
+              <ns2:graphicData uri="http://schemas.openxmlformats.org/drawingml/2006/picture">
+                <ns3:pic>
+                  <ns3:nvPicPr>
+                    <ns3:cNvPr id="0" name="screenshot-08-reminder-limit.png"/>
+                    <ns3:cNvPicPr/>
+                  </ns3:nvPicPr>
+                  <ns3:blipFill>
+                    <ns2:blip ns4:embed="rId11"/>
+                    <ns2:stretch>
+                      <ns2:fillRect/>
+                    </ns2:stretch>
+                  </ns3:blipFill>
+                  <ns3:spPr>
+                    <ns2:xfrm>
+                      <ns2:off x="0" y="0"/>
+                      <ns2:ext cx="3977640" cy="7473600"/>
+                    </ns2:xfrm>
+                    <ns2:prstGeom prst="rect">
+                      <ns2:avLst/>
+                    </ns2:prstGeom>
+                  </ns3:spPr>
+                </ns3:pic>
+              </ns2:graphicData>
+            </ns2:graphic>
+          </ns1:inline>
+        </w:drawing>
+      </w:r>
+    </w:p>
+    <w:p>
+      <w:pPr>
+        <w:spacing w:before="0" w:after="100" w:line="276" w:lineRule="auto"/>
+        <w:jc w:val="center"/>
+      </w:pPr>
+      <w:r>
+        <w:rPr>
+          <w:b/>
+        </w:rPr>
+        <w:t>Gambar 11 — State batas verifikasi GPS dan reminder sudah tercapai.</w:t>
+      </w:r>
+    </w:p>
+    <w:p>
+      <w:pPr>
+        <w:spacing w:before="0" w:after="100" w:line="276" w:lineRule="auto"/>
+      </w:pPr>
+      <w:r>
+        <w:rPr/>
+        <w:t>Arahan CS: jangan meminta customer menekan tombol berulang dan jangan membuat link baru tanpa validasi. Periksa status sesi di dashboard, catat nama, nomor terdaftar, waktu percobaan, dan screenshot bila diperlukan. Jika batas benar-benar habis, eskalasikan ke Ops/CS untuk pemeriksaan manual dan tindak lanjut resmi.</w:t>
       </w:r>
     </w:p>
     <w:p>

</xml_diff>